<commit_message>
Change 16: Prism Fund: applications closed early because available funds have been committed (page kept, deadline unchanged).
Independent test branch created directly from BASELINE v1-original
(a5b0342). Contains this change only.

Co-Authored-By: Claude Opus 5.5 <noreply@anthropic.com>
Claude-Session: https://claude.ai/code/session_01CQxLpwe1Pu1FJJBAM5jt5M
</commit_message>
<xml_diff>
--- a/documents-src/guidelines/cpcf-prism-fund-2026-2027-grant-guidelines.docx
+++ b/documents-src/guidelines/cpcf-prism-fund-2026-2027-grant-guidelines.docx
@@ -31,7 +31,7 @@
           <w:color w:val="5F6B6E"/>
           <w:sz w:val="22"/>
         </w:rPr>
-        <w:t>Competitive grant  ·  Accepting applications through November 20, 2026</w:t>
+        <w:t>Competitive grant  ·  Closed early: applications are no longer being accepted</w:t>
       </w:r>
     </w:p>
     <w:tbl>
@@ -508,6 +508,44 @@
                 <w:b/>
                 <w:sz w:val="19"/>
               </w:rPr>
+              <w:t>Application status</w:t>
+            </w:r>
+          </w:p>
+        </w:tc>
+        <w:tc>
+          <w:tcPr>
+            <w:tcW w:type="dxa" w:w="6192"/>
+          </w:tcPr>
+          <w:p>
+            <w:pPr>
+              <w:spacing w:after="40"/>
+            </w:pPr>
+            <w:r/>
+            <w:r>
+              <w:rPr>
+                <w:sz w:val="19"/>
+              </w:rPr>
+              <w:t>Closed early. Applications have closed early because available funds have been committed.</w:t>
+            </w:r>
+          </w:p>
+        </w:tc>
+      </w:tr>
+      <w:tr>
+        <w:tc>
+          <w:tcPr>
+            <w:tcW w:type="dxa" w:w="3456"/>
+            <w:shd w:val="clear" w:color="auto" w:fill="F4EEE4"/>
+          </w:tcPr>
+          <w:p>
+            <w:pPr>
+              <w:spacing w:after="40"/>
+            </w:pPr>
+            <w:r/>
+            <w:r>
+              <w:rPr>
+                <w:b/>
+                <w:sz w:val="19"/>
+              </w:rPr>
               <w:t>Decision</w:t>
             </w:r>
           </w:p>

</xml_diff>